<commit_message>
Update automation scripts and standardise naming conventions
</commit_message>
<xml_diff>
--- a/scripts/templates/Completion_Certificate.docx
+++ b/scripts/templates/Completion_Certificate.docx
@@ -118,7 +118,6 @@
           </mc:Fallback>
         </mc:AlternateContent>
       </w:r>
-      <w:bookmarkStart w:id="0" w:name="_GoBack"/>
       <w:r>
         <w:rPr>
           <w:noProof/>
@@ -5718,7 +5717,6 @@
           </mc:Fallback>
         </mc:AlternateContent>
       </w:r>
-      <w:bookmarkEnd w:id="0"/>
       <w:r>
         <w:rPr>
           <w:noProof/>
@@ -5941,7 +5939,23 @@
                                 <w:rFonts w:ascii="Times New Roman" w:hAnsi="Times New Roman" w:cs="Times New Roman"/>
                                 <w:sz w:val="32"/>
                               </w:rPr>
-                              <w:t>{FULL_NAME} showed dedication, discipline, and a commitment to learning throughout the internship. We wish her continued success.</w:t>
+                              <w:t xml:space="preserve">{FULL_NAME} showed dedication, discipline, and a commitment to learning throughout the internship. </w:t>
+                            </w:r>
+                            <w:r>
+                              <w:rPr>
+                                <w:rFonts w:ascii="Times New Roman" w:hAnsi="Times New Roman" w:cs="Times New Roman"/>
+                                <w:sz w:val="32"/>
+                              </w:rPr>
+                              <w:t>We wish them</w:t>
+                            </w:r>
+                            <w:bookmarkStart w:id="0" w:name="_GoBack"/>
+                            <w:bookmarkEnd w:id="0"/>
+                            <w:r>
+                              <w:rPr>
+                                <w:rFonts w:ascii="Times New Roman" w:hAnsi="Times New Roman" w:cs="Times New Roman"/>
+                                <w:sz w:val="32"/>
+                              </w:rPr>
+                              <w:t xml:space="preserve"> continued success.</w:t>
                             </w:r>
                           </w:p>
                         </w:txbxContent>
@@ -5963,6 +5977,10 @@
           </mc:Choice>
           <mc:Fallback>
             <w:pict>
+              <v:shapetype w14:anchorId="7F0E0A7F" id="_x0000_t202" coordsize="21600,21600" o:spt="202" path="m,l,21600r21600,l21600,xe">
+                <v:stroke joinstyle="miter"/>
+                <v:path gradientshapeok="t" o:connecttype="rect"/>
+              </v:shapetype>
               <v:shape id="Text Box 41" o:spid="_x0000_s1028" type="#_x0000_t202" style="position:absolute;margin-left:0;margin-top:227.6pt;width:661.95pt;height:110.7pt;z-index:251660288;visibility:visible;mso-wrap-style:square;mso-height-percent:0;mso-wrap-distance-left:9pt;mso-wrap-distance-top:0;mso-wrap-distance-right:9pt;mso-wrap-distance-bottom:0;mso-position-horizontal:center;mso-position-horizontal-relative:margin;mso-position-vertical:absolute;mso-position-vertical-relative:text;mso-height-percent:0;mso-height-relative:margin;v-text-anchor:top" o:gfxdata="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" filled="f" stroked="f" strokeweight=".5pt">
                 <v:textbox>
                   <w:txbxContent>
@@ -6031,7 +6049,23 @@
                           <w:rFonts w:ascii="Times New Roman" w:hAnsi="Times New Roman" w:cs="Times New Roman"/>
                           <w:sz w:val="32"/>
                         </w:rPr>
-                        <w:t>{FULL_NAME} showed dedication, discipline, and a commitment to learning throughout the internship. We wish her continued success.</w:t>
+                        <w:t xml:space="preserve">{FULL_NAME} showed dedication, discipline, and a commitment to learning throughout the internship. </w:t>
+                      </w:r>
+                      <w:r>
+                        <w:rPr>
+                          <w:rFonts w:ascii="Times New Roman" w:hAnsi="Times New Roman" w:cs="Times New Roman"/>
+                          <w:sz w:val="32"/>
+                        </w:rPr>
+                        <w:t>We wish them</w:t>
+                      </w:r>
+                      <w:bookmarkStart w:id="1" w:name="_GoBack"/>
+                      <w:bookmarkEnd w:id="1"/>
+                      <w:r>
+                        <w:rPr>
+                          <w:rFonts w:ascii="Times New Roman" w:hAnsi="Times New Roman" w:cs="Times New Roman"/>
+                          <w:sz w:val="32"/>
+                        </w:rPr>
+                        <w:t xml:space="preserve"> continued success.</w:t>
                       </w:r>
                     </w:p>
                   </w:txbxContent>

</xml_diff>

<commit_message>
Fix certificate QR generation/embed logic and update requirements
</commit_message>
<xml_diff>
--- a/scripts/templates/Completion_Certificate.docx
+++ b/scripts/templates/Completion_Certificate.docx
@@ -17,18 +17,18 @@
         <mc:AlternateContent>
           <mc:Choice Requires="wps">
             <w:drawing>
-              <wp:anchor distT="45720" distB="45720" distL="114300" distR="114300" simplePos="0" relativeHeight="251662336" behindDoc="0" locked="0" layoutInCell="1" allowOverlap="1" wp14:anchorId="7F0E0A79" wp14:editId="7F0E0A7A">
+              <wp:anchor distT="45720" distB="45720" distL="114300" distR="114300" simplePos="0" relativeHeight="251664384" behindDoc="0" locked="0" layoutInCell="1" allowOverlap="1" wp14:anchorId="329C55BE" wp14:editId="7D8D3A28">
                 <wp:simplePos x="0" y="0"/>
-                <wp:positionH relativeFrom="column">
-                  <wp:posOffset>474335</wp:posOffset>
+                <wp:positionH relativeFrom="margin">
+                  <wp:posOffset>6181725</wp:posOffset>
                 </wp:positionH>
                 <wp:positionV relativeFrom="paragraph">
-                  <wp:posOffset>4918511</wp:posOffset>
+                  <wp:posOffset>400050</wp:posOffset>
                 </wp:positionV>
-                <wp:extent cx="2360930" cy="1404620"/>
+                <wp:extent cx="1504950" cy="1381125"/>
                 <wp:effectExtent l="0" t="0" r="0" b="0"/>
                 <wp:wrapSquare wrapText="bothSides"/>
-                <wp:docPr id="42" name="Text Box 2"/>
+                <wp:docPr id="15" name="Text Box 2"/>
                 <wp:cNvGraphicFramePr>
                   <a:graphicFrameLocks xmlns:a="http://schemas.openxmlformats.org/drawingml/2006/main"/>
                 </wp:cNvGraphicFramePr>
@@ -41,7 +41,7 @@
                       <wps:spPr bwMode="auto">
                         <a:xfrm>
                           <a:off x="0" y="0"/>
-                          <a:ext cx="2360930" cy="1404620"/>
+                          <a:ext cx="1504950" cy="1381125"/>
                         </a:xfrm>
                         <a:prstGeom prst="rect">
                           <a:avLst/>
@@ -59,60 +59,78 @@
                           <w:p>
                             <w:pPr>
                               <w:jc w:val="center"/>
-                              <w:rPr>
-                                <w:sz w:val="32"/>
-                              </w:rPr>
+                            </w:pPr>
+                            <w:bookmarkStart w:id="0" w:name="_GoBack"/>
+                            <w:r>
+                              <w:t>{QR_CODE}</w:t>
+                            </w:r>
+                          </w:p>
+                          <w:p>
+                            <w:pPr>
+                              <w:jc w:val="center"/>
+                            </w:pPr>
+                          </w:p>
+                          <w:p>
+                            <w:pPr>
+                              <w:jc w:val="center"/>
                             </w:pPr>
                             <w:r>
-                              <w:rPr>
-                                <w:sz w:val="32"/>
-                              </w:rPr>
-                              <w:t>{CURRENT_DATE}</w:t>
+                              <w:t>{Certificate_ID}</w:t>
                             </w:r>
+                            <w:bookmarkEnd w:id="0"/>
                           </w:p>
                         </w:txbxContent>
                       </wps:txbx>
                       <wps:bodyPr rot="0" vert="horz" wrap="square" lIns="91440" tIns="45720" rIns="91440" bIns="45720" anchor="t" anchorCtr="0">
-                        <a:spAutoFit/>
+                        <a:noAutofit/>
                       </wps:bodyPr>
                     </wps:wsp>
                   </a:graphicData>
                 </a:graphic>
                 <wp14:sizeRelH relativeFrom="margin">
-                  <wp14:pctWidth>40000</wp14:pctWidth>
+                  <wp14:pctWidth>0</wp14:pctWidth>
                 </wp14:sizeRelH>
                 <wp14:sizeRelV relativeFrom="margin">
-                  <wp14:pctHeight>20000</wp14:pctHeight>
+                  <wp14:pctHeight>0</wp14:pctHeight>
                 </wp14:sizeRelV>
               </wp:anchor>
             </w:drawing>
           </mc:Choice>
           <mc:Fallback>
             <w:pict>
-              <v:shapetype id="_x0000_t202" coordsize="21600,21600" o:spt="202" path="m,l,21600r21600,l21600,xe">
+              <v:shapetype w14:anchorId="329C55BE" id="_x0000_t202" coordsize="21600,21600" o:spt="202" path="m,l,21600r21600,l21600,xe">
                 <v:stroke joinstyle="miter"/>
                 <v:path gradientshapeok="t" o:connecttype="rect"/>
               </v:shapetype>
-              <v:shape id="Text Box 2" o:spid="_x0000_s1026" type="#_x0000_t202" style="position:absolute;margin-left:37.35pt;margin-top:387.3pt;width:185.9pt;height:110.6pt;z-index:251662336;visibility:visible;mso-wrap-style:square;mso-width-percent:400;mso-height-percent:200;mso-wrap-distance-left:9pt;mso-wrap-distance-top:3.6pt;mso-wrap-distance-right:9pt;mso-wrap-distance-bottom:3.6pt;mso-position-horizontal:absolute;mso-position-horizontal-relative:text;mso-position-vertical:absolute;mso-position-vertical-relative:text;mso-width-percent:400;mso-height-percent:200;mso-width-relative:margin;mso-height-relative:margin;v-text-anchor:top" o:gfxdata="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" filled="f" stroked="f">
-                <v:textbox style="mso-fit-shape-to-text:t">
+              <v:shape id="Text Box 2" o:spid="_x0000_s1026" type="#_x0000_t202" style="position:absolute;margin-left:486.75pt;margin-top:31.5pt;width:118.5pt;height:108.75pt;z-index:251664384;visibility:visible;mso-wrap-style:square;mso-width-percent:0;mso-height-percent:0;mso-wrap-distance-left:9pt;mso-wrap-distance-top:3.6pt;mso-wrap-distance-right:9pt;mso-wrap-distance-bottom:3.6pt;mso-position-horizontal:absolute;mso-position-horizontal-relative:margin;mso-position-vertical:absolute;mso-position-vertical-relative:text;mso-width-percent:0;mso-height-percent:0;mso-width-relative:margin;mso-height-relative:margin;v-text-anchor:top" o:gfxdata="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" filled="f" stroked="f">
+                <v:textbox>
                   <w:txbxContent>
                     <w:p>
                       <w:pPr>
                         <w:jc w:val="center"/>
-                        <w:rPr>
-                          <w:sz w:val="32"/>
-                        </w:rPr>
+                      </w:pPr>
+                      <w:bookmarkStart w:id="1" w:name="_GoBack"/>
+                      <w:r>
+                        <w:t>{QR_CODE}</w:t>
+                      </w:r>
+                    </w:p>
+                    <w:p>
+                      <w:pPr>
+                        <w:jc w:val="center"/>
+                      </w:pPr>
+                    </w:p>
+                    <w:p>
+                      <w:pPr>
+                        <w:jc w:val="center"/>
                       </w:pPr>
                       <w:r>
-                        <w:rPr>
-                          <w:sz w:val="32"/>
-                        </w:rPr>
-                        <w:t>{CURRENT_DATE}</w:t>
+                        <w:t>{Certificate_ID}</w:t>
                       </w:r>
+                      <w:bookmarkEnd w:id="1"/>
                     </w:p>
                   </w:txbxContent>
                 </v:textbox>
-                <w10:wrap type="square"/>
+                <w10:wrap type="square" anchorx="margin"/>
               </v:shape>
             </w:pict>
           </mc:Fallback>
@@ -126,7 +144,7 @@
         <mc:AlternateContent>
           <mc:Choice Requires="wpg">
             <w:drawing>
-              <wp:anchor distT="0" distB="0" distL="0" distR="0" simplePos="0" relativeHeight="15728640" behindDoc="0" locked="0" layoutInCell="1" allowOverlap="1" wp14:anchorId="7F0E0A7B" wp14:editId="7F0E0A7C">
+              <wp:anchor distT="0" distB="0" distL="0" distR="0" simplePos="0" relativeHeight="15728640" behindDoc="0" locked="0" layoutInCell="1" allowOverlap="1" wp14:anchorId="7F0E0A7B" wp14:editId="279B3438">
                 <wp:simplePos x="0" y="0"/>
                 <wp:positionH relativeFrom="page">
                   <wp:posOffset>0</wp:posOffset>
@@ -134,7 +152,7 @@
                 <wp:positionV relativeFrom="page">
                   <wp:posOffset>0</wp:posOffset>
                 </wp:positionV>
-                <wp:extent cx="10160635" cy="7765576"/>
+                <wp:extent cx="10160635" cy="7765415"/>
                 <wp:effectExtent l="0" t="0" r="0" b="6985"/>
                 <wp:wrapNone/>
                 <wp:docPr id="1" name="Group 1"/>
@@ -150,7 +168,7 @@
                       <wpg:grpSpPr>
                         <a:xfrm>
                           <a:off x="0" y="0"/>
-                          <a:ext cx="10160635" cy="7765576"/>
+                          <a:ext cx="10160635" cy="7765415"/>
                           <a:chOff x="-8247" y="-331711"/>
                           <a:chExt cx="10161351" cy="7765960"/>
                         </a:xfrm>
@@ -3225,7 +3243,7 @@
                         </pic:blipFill>
                         <pic:spPr>
                           <a:xfrm>
-                            <a:off x="851916" y="798576"/>
+                            <a:off x="794762" y="989085"/>
                             <a:ext cx="1431035" cy="1432559"/>
                           </a:xfrm>
                           <a:prstGeom prst="rect">
@@ -5631,7 +5649,7 @@
           </mc:Choice>
           <mc:Fallback>
             <w:pict>
-              <v:group w14:anchorId="202D3917" id="Group 1" o:spid="_x0000_s1026" style="position:absolute;margin-left:0;margin-top:0;width:800.05pt;height:611.45pt;z-index:15728640;mso-wrap-distance-left:0;mso-wrap-distance-right:0;mso-position-horizontal-relative:page;mso-position-vertical-relative:page;mso-width-relative:margin;mso-height-relative:margin" coordorigin="-82,-3317" coordsize="101613,77659" o:gfxdata="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">
+              <v:group w14:anchorId="7591AE1F" id="Group 1" o:spid="_x0000_s1026" style="position:absolute;margin-left:0;margin-top:0;width:800.05pt;height:611.45pt;z-index:15728640;mso-wrap-distance-left:0;mso-wrap-distance-right:0;mso-position-horizontal-relative:page;mso-position-vertical-relative:page;mso-width-relative:margin;mso-height-relative:margin" coordorigin="-82,-3317" coordsize="101613,77659" o:gfxdata="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">
                 <v:shapetype id="_x0000_t75" coordsize="21600,21600" o:spt="75" o:preferrelative="t" path="m@4@5l@4@11@9@11@9@5xe" filled="f" stroked="f">
                   <v:stroke joinstyle="miter"/>
                   <v:formulas>
@@ -5684,7 +5702,7 @@
                 <v:shape id="Graphic 12" o:spid="_x0000_s1037" style="position:absolute;left:26167;top:58064;width:47929;height:13;visibility:visible;mso-wrap-style:square;v-text-anchor:top" coordsize="4792980,1270" o:gfxdata="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" path="m,l1342644,em3450335,l4792980,e" filled="f" strokecolor="#38b6ff" strokeweight="1.44pt">
                   <v:path arrowok="t"/>
                 </v:shape>
-                <v:shape id="Image 13" o:spid="_x0000_s1038" type="#_x0000_t75" style="position:absolute;left:8519;top:7985;width:14310;height:14326;visibility:visible;mso-wrap-style:square" o:gfxdata="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">
+                <v:shape id="Image 13" o:spid="_x0000_s1038" type="#_x0000_t75" style="position:absolute;left:7947;top:9890;width:14310;height:14326;visibility:visible;mso-wrap-style:square" o:gfxdata="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">
                   <v:imagedata r:id="rId19" o:title=""/>
                 </v:shape>
                 <v:shape id="Image 14" o:spid="_x0000_s1039" type="#_x0000_t75" style="position:absolute;left:58399;top:51922;width:17999;height:7011;visibility:visible;mso-wrap-style:square" o:gfxdata="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">
@@ -5713,6 +5731,111 @@
                 </v:shape>
                 <w10:wrap anchorx="page" anchory="page"/>
               </v:group>
+            </w:pict>
+          </mc:Fallback>
+        </mc:AlternateContent>
+      </w:r>
+      <w:r>
+        <w:rPr>
+          <w:noProof/>
+          <w:sz w:val="17"/>
+        </w:rPr>
+        <mc:AlternateContent>
+          <mc:Choice Requires="wps">
+            <w:drawing>
+              <wp:anchor distT="45720" distB="45720" distL="114300" distR="114300" simplePos="0" relativeHeight="251662336" behindDoc="0" locked="0" layoutInCell="1" allowOverlap="1" wp14:anchorId="7F0E0A79" wp14:editId="42D5DD9A">
+                <wp:simplePos x="0" y="0"/>
+                <wp:positionH relativeFrom="column">
+                  <wp:posOffset>474335</wp:posOffset>
+                </wp:positionH>
+                <wp:positionV relativeFrom="paragraph">
+                  <wp:posOffset>4918511</wp:posOffset>
+                </wp:positionV>
+                <wp:extent cx="2360930" cy="1404620"/>
+                <wp:effectExtent l="0" t="0" r="0" b="0"/>
+                <wp:wrapSquare wrapText="bothSides"/>
+                <wp:docPr id="42" name="Text Box 2"/>
+                <wp:cNvGraphicFramePr>
+                  <a:graphicFrameLocks xmlns:a="http://schemas.openxmlformats.org/drawingml/2006/main"/>
+                </wp:cNvGraphicFramePr>
+                <a:graphic xmlns:a="http://schemas.openxmlformats.org/drawingml/2006/main">
+                  <a:graphicData uri="http://schemas.microsoft.com/office/word/2010/wordprocessingShape">
+                    <wps:wsp>
+                      <wps:cNvSpPr txBox="1">
+                        <a:spLocks noChangeArrowheads="1"/>
+                      </wps:cNvSpPr>
+                      <wps:spPr bwMode="auto">
+                        <a:xfrm>
+                          <a:off x="0" y="0"/>
+                          <a:ext cx="2360930" cy="1404620"/>
+                        </a:xfrm>
+                        <a:prstGeom prst="rect">
+                          <a:avLst/>
+                        </a:prstGeom>
+                        <a:noFill/>
+                        <a:ln w="9525">
+                          <a:noFill/>
+                          <a:miter lim="800000"/>
+                          <a:headEnd/>
+                          <a:tailEnd/>
+                        </a:ln>
+                      </wps:spPr>
+                      <wps:txbx>
+                        <w:txbxContent>
+                          <w:p>
+                            <w:pPr>
+                              <w:jc w:val="center"/>
+                              <w:rPr>
+                                <w:sz w:val="32"/>
+                              </w:rPr>
+                            </w:pPr>
+                            <w:r>
+                              <w:rPr>
+                                <w:sz w:val="32"/>
+                              </w:rPr>
+                              <w:t>{CURRENT_DATE}</w:t>
+                            </w:r>
+                          </w:p>
+                        </w:txbxContent>
+                      </wps:txbx>
+                      <wps:bodyPr rot="0" vert="horz" wrap="square" lIns="91440" tIns="45720" rIns="91440" bIns="45720" anchor="t" anchorCtr="0">
+                        <a:spAutoFit/>
+                      </wps:bodyPr>
+                    </wps:wsp>
+                  </a:graphicData>
+                </a:graphic>
+                <wp14:sizeRelH relativeFrom="margin">
+                  <wp14:pctWidth>40000</wp14:pctWidth>
+                </wp14:sizeRelH>
+                <wp14:sizeRelV relativeFrom="margin">
+                  <wp14:pctHeight>20000</wp14:pctHeight>
+                </wp14:sizeRelV>
+              </wp:anchor>
+            </w:drawing>
+          </mc:Choice>
+          <mc:Fallback>
+            <w:pict>
+              <v:shape w14:anchorId="7F0E0A79" id="_x0000_s1027" type="#_x0000_t202" style="position:absolute;margin-left:37.35pt;margin-top:387.3pt;width:185.9pt;height:110.6pt;z-index:251662336;visibility:visible;mso-wrap-style:square;mso-width-percent:400;mso-height-percent:200;mso-wrap-distance-left:9pt;mso-wrap-distance-top:3.6pt;mso-wrap-distance-right:9pt;mso-wrap-distance-bottom:3.6pt;mso-position-horizontal:absolute;mso-position-horizontal-relative:text;mso-position-vertical:absolute;mso-position-vertical-relative:text;mso-width-percent:400;mso-height-percent:200;mso-width-relative:margin;mso-height-relative:margin;v-text-anchor:top" o:gfxdata="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" filled="f" stroked="f">
+                <v:textbox style="mso-fit-shape-to-text:t">
+                  <w:txbxContent>
+                    <w:p>
+                      <w:pPr>
+                        <w:jc w:val="center"/>
+                        <w:rPr>
+                          <w:sz w:val="32"/>
+                        </w:rPr>
+                      </w:pPr>
+                      <w:r>
+                        <w:rPr>
+                          <w:sz w:val="32"/>
+                        </w:rPr>
+                        <w:t>{CURRENT_DATE}</w:t>
+                      </w:r>
+                    </w:p>
+                  </w:txbxContent>
+                </v:textbox>
+                <w10:wrap type="square"/>
+              </v:shape>
             </w:pict>
           </mc:Fallback>
         </mc:AlternateContent>
@@ -5948,8 +6071,6 @@
                               </w:rPr>
                               <w:t>We wish them</w:t>
                             </w:r>
-                            <w:bookmarkStart w:id="0" w:name="_GoBack"/>
-                            <w:bookmarkEnd w:id="0"/>
                             <w:r>
                               <w:rPr>
                                 <w:rFonts w:ascii="Times New Roman" w:hAnsi="Times New Roman" w:cs="Times New Roman"/>

</xml_diff>